<commit_message>
Add v0.4.8.7 quick patches 1–5
Rebalance Lockdown badge caps and migrate over-cap badges without losing progress or earned rewards; keep players off active courts and ensure green layups finish cleanly. Add live park-game watching and badge-tier updates, plus synchronized auto-play for online Pro-Am.
</commit_message>
<xml_diff>
--- a/PATCH_NOTES_v0.4.8.7.docx
+++ b/PATCH_NOTES_v0.4.8.7.docx
@@ -566,6 +566,1071 @@
           <w:color w:val="1F2328"/>
         </w:rPr>
         <w:t xml:space="preserve"> line on the server console.</w:t>
+      </w:r>
+    </w:p>
+    <w:p>
+      <w:pPr>
+        <w:pBdr>
+          <w:bottom w:val="single" w:color="D0D7DE" w:sz="4" w:space="1"/>
+        </w:pBdr>
+        <w:spacing w:after="160" w:before="80"/>
+      </w:pPr>
+    </w:p>
+    <w:p>
+      <w:pPr>
+        <w:pStyle w:val="Heading1"/>
+        <w:spacing w:after="120" w:before="280"/>
+      </w:pPr>
+      <w:r>
+        <w:rPr>
+          <w:rFonts w:ascii="Calibri" w:cs="Calibri" w:eastAsia="Calibri" w:hAnsi="Calibri"/>
+          <w:b/>
+          <w:bCs/>
+          <w:color w:val="C8102E"/>
+          <w:sz w:val="32"/>
+          <w:szCs w:val="32"/>
+        </w:rPr>
+        <w:t xml:space="preserve">Quick patch 1 (Oct 21): Lockdowns get defensive Hall of Fame badges</w:t>
+      </w:r>
+    </w:p>
+    <w:p>
+      <w:pPr>
+        <w:spacing w:after="140" w:line="288"/>
+      </w:pPr>
+      <w:r>
+        <w:rPr>
+          <w:rFonts w:ascii="Calibri" w:cs="Calibri" w:eastAsia="Calibri" w:hAnsi="Calibri"/>
+          <w:b/>
+          <w:bCs/>
+          <w:color w:val="1F2328"/>
+        </w:rPr>
+        <w:t xml:space="preserve">A Lockdown's shooting badges stop at Silver.</w:t>
+      </w:r>
+      <w:r>
+        <w:rPr>
+          <w:rFonts w:ascii="Calibri" w:cs="Calibri" w:eastAsia="Calibri" w:hAnsi="Calibri"/>
+          <w:color w:val="1F2328"/>
+        </w:rPr>
+        <w:t xml:space="preserve"> Deadeye, Catch &amp; Shoot and Corner Specialist now top out at Silver on a Lockdown, the same as Green Machine; Limitless stays at Bronze.</w:t>
+      </w:r>
+    </w:p>
+    <w:p>
+      <w:pPr>
+        <w:spacing w:after="140" w:line="288"/>
+      </w:pPr>
+      <w:r>
+        <w:rPr>
+          <w:rFonts w:ascii="Calibri" w:cs="Calibri" w:eastAsia="Calibri" w:hAnsi="Calibri"/>
+          <w:b/>
+          <w:bCs/>
+          <w:color w:val="1F2328"/>
+        </w:rPr>
+        <w:t xml:space="preserve">Defensive Hall of Fame badges take their place:</w:t>
+      </w:r>
+    </w:p>
+    <w:p>
+      <w:pPr>
+        <w:pStyle w:val="ListParagraph"/>
+        <w:numPr>
+          <w:ilvl w:val="0"/>
+          <w:numId w:val="2"/>
+        </w:numPr>
+        <w:spacing w:after="80" w:line="276"/>
+      </w:pPr>
+      <w:r>
+        <w:rPr>
+          <w:rFonts w:ascii="Calibri" w:cs="Calibri" w:eastAsia="Calibri" w:hAnsi="Calibri"/>
+          <w:b/>
+          <w:bCs/>
+          <w:color w:val="1F2328"/>
+        </w:rPr>
+        <w:t xml:space="preserve">Rebound Chaser</w:t>
+      </w:r>
+      <w:r>
+        <w:rPr>
+          <w:rFonts w:ascii="Calibri" w:cs="Calibri" w:eastAsia="Calibri" w:hAnsi="Calibri"/>
+          <w:color w:val="1F2328"/>
+        </w:rPr>
+        <w:t xml:space="preserve"> now reaches Hall of Fame on a Lockdown.</w:t>
+      </w:r>
+    </w:p>
+    <w:p>
+      <w:pPr>
+        <w:pStyle w:val="ListParagraph"/>
+        <w:numPr>
+          <w:ilvl w:val="0"/>
+          <w:numId w:val="2"/>
+        </w:numPr>
+        <w:spacing w:after="80" w:line="276"/>
+      </w:pPr>
+      <w:r>
+        <w:rPr>
+          <w:rFonts w:ascii="Calibri" w:cs="Calibri" w:eastAsia="Calibri" w:hAnsi="Calibri"/>
+          <w:b/>
+          <w:bCs/>
+          <w:color w:val="1F2328"/>
+        </w:rPr>
+        <w:t xml:space="preserve">The height limits are lifted for a Lockdown's defense:</w:t>
+      </w:r>
+    </w:p>
+    <w:p>
+      <w:pPr>
+        <w:pStyle w:val="ListParagraph"/>
+        <w:numPr>
+          <w:ilvl w:val="1"/>
+          <w:numId w:val="2"/>
+        </w:numPr>
+        <w:spacing w:after="80" w:line="276"/>
+      </w:pPr>
+      <w:r>
+        <w:rPr>
+          <w:rFonts w:ascii="Calibri" w:cs="Calibri" w:eastAsia="Calibri" w:hAnsi="Calibri"/>
+          <w:color w:val="1F2328"/>
+        </w:rPr>
+        <w:t xml:space="preserve">Chasedown and Brick Wall reach Hall of Fame at every height.</w:t>
+      </w:r>
+    </w:p>
+    <w:p>
+      <w:pPr>
+        <w:pStyle w:val="ListParagraph"/>
+        <w:numPr>
+          <w:ilvl w:val="1"/>
+          <w:numId w:val="2"/>
+        </w:numPr>
+        <w:spacing w:after="80" w:line="276"/>
+      </w:pPr>
+      <w:r>
+        <w:rPr>
+          <w:rFonts w:ascii="Calibri" w:cs="Calibri" w:eastAsia="Calibri" w:hAnsi="Calibri"/>
+          <w:color w:val="1F2328"/>
+        </w:rPr>
+        <w:t xml:space="preserve">Rim Protector reaches it from 6'3" up.</w:t>
+      </w:r>
+    </w:p>
+    <w:p>
+      <w:pPr>
+        <w:pStyle w:val="ListParagraph"/>
+        <w:numPr>
+          <w:ilvl w:val="1"/>
+          <w:numId w:val="2"/>
+        </w:numPr>
+        <w:spacing w:after="80" w:line="276"/>
+      </w:pPr>
+      <w:r>
+        <w:rPr>
+          <w:rFonts w:ascii="Calibri" w:cs="Calibri" w:eastAsia="Calibri" w:hAnsi="Calibri"/>
+          <w:color w:val="1F2328"/>
+        </w:rPr>
+        <w:t xml:space="preserve">Pick Pocket reaches it at 7'1" and up.</w:t>
+      </w:r>
+    </w:p>
+    <w:tbl>
+      <w:tblPr>
+        <w:tblW w:type="dxa" w:w="9360"/>
+        <w:tblBorders>
+          <w:top w:val="single" w:color="auto" w:sz="4"/>
+          <w:left w:val="single" w:color="auto" w:sz="4"/>
+          <w:bottom w:val="single" w:color="auto" w:sz="4"/>
+          <w:right w:val="single" w:color="auto" w:sz="4"/>
+          <w:insideH w:val="single" w:color="auto" w:sz="4"/>
+          <w:insideV w:val="single" w:color="auto" w:sz="4"/>
+        </w:tblBorders>
+      </w:tblPr>
+      <w:tblGrid>
+        <w:gridCol w:w="1477"/>
+        <w:gridCol w:w="7883"/>
+      </w:tblGrid>
+      <w:tr>
+        <w:trPr>
+          <w:cantSplit/>
+          <w:tblHeader/>
+        </w:trPr>
+        <w:tc>
+          <w:tcPr>
+            <w:tcW w:type="dxa" w:w="1477"/>
+            <w:tcBorders>
+              <w:top w:val="single" w:color="D0D7DE" w:sz="4"/>
+              <w:left w:val="single" w:color="D0D7DE" w:sz="4"/>
+              <w:bottom w:val="single" w:color="D0D7DE" w:sz="4"/>
+              <w:right w:val="single" w:color="D0D7DE" w:sz="4"/>
+            </w:tcBorders>
+            <w:shd w:fill="F3E3E6" w:color="auto" w:val="clear"/>
+            <w:tcMar>
+              <w:top w:type="dxa" w:w="60"/>
+              <w:left w:type="dxa" w:w="100"/>
+              <w:bottom w:type="dxa" w:w="60"/>
+              <w:right w:type="dxa" w:w="100"/>
+            </w:tcMar>
+          </w:tcPr>
+          <w:p>
+            <w:pPr>
+              <w:jc w:val="left"/>
+            </w:pPr>
+            <w:r>
+              <w:rPr>
+                <w:rFonts w:ascii="Calibri" w:cs="Calibri" w:eastAsia="Calibri" w:hAnsi="Calibri"/>
+                <w:b/>
+                <w:bCs/>
+                <w:color w:val="1F2328"/>
+              </w:rPr>
+              <w:t xml:space="preserve">Lockdown height</w:t>
+            </w:r>
+          </w:p>
+        </w:tc>
+        <w:tc>
+          <w:tcPr>
+            <w:tcW w:type="dxa" w:w="7883"/>
+            <w:tcBorders>
+              <w:top w:val="single" w:color="D0D7DE" w:sz="4"/>
+              <w:left w:val="single" w:color="D0D7DE" w:sz="4"/>
+              <w:bottom w:val="single" w:color="D0D7DE" w:sz="4"/>
+              <w:right w:val="single" w:color="D0D7DE" w:sz="4"/>
+            </w:tcBorders>
+            <w:shd w:fill="F3E3E6" w:color="auto" w:val="clear"/>
+            <w:tcMar>
+              <w:top w:type="dxa" w:w="60"/>
+              <w:left w:type="dxa" w:w="100"/>
+              <w:bottom w:type="dxa" w:w="60"/>
+              <w:right w:type="dxa" w:w="100"/>
+            </w:tcMar>
+          </w:tcPr>
+          <w:p>
+            <w:pPr>
+              <w:jc w:val="left"/>
+            </w:pPr>
+            <w:r>
+              <w:rPr>
+                <w:rFonts w:ascii="Calibri" w:cs="Calibri" w:eastAsia="Calibri" w:hAnsi="Calibri"/>
+                <w:b/>
+                <w:bCs/>
+                <w:color w:val="1F2328"/>
+              </w:rPr>
+              <w:t xml:space="preserve">Hall of Fame badges</w:t>
+            </w:r>
+          </w:p>
+        </w:tc>
+      </w:tr>
+      <w:tr>
+        <w:trPr>
+          <w:cantSplit/>
+          <w:tblHeader w:val="false"/>
+        </w:trPr>
+        <w:tc>
+          <w:tcPr>
+            <w:tcW w:type="dxa" w:w="1477"/>
+            <w:tcBorders>
+              <w:top w:val="single" w:color="D0D7DE" w:sz="4"/>
+              <w:left w:val="single" w:color="D0D7DE" w:sz="4"/>
+              <w:bottom w:val="single" w:color="D0D7DE" w:sz="4"/>
+              <w:right w:val="single" w:color="D0D7DE" w:sz="4"/>
+            </w:tcBorders>
+            <w:tcMar>
+              <w:top w:type="dxa" w:w="60"/>
+              <w:left w:type="dxa" w:w="100"/>
+              <w:bottom w:type="dxa" w:w="60"/>
+              <w:right w:type="dxa" w:w="100"/>
+            </w:tcMar>
+          </w:tcPr>
+          <w:p>
+            <w:pPr>
+              <w:jc w:val="left"/>
+            </w:pPr>
+            <w:r>
+              <w:rPr>
+                <w:rFonts w:ascii="Calibri" w:cs="Calibri" w:eastAsia="Calibri" w:hAnsi="Calibri"/>
+                <w:color w:val="1F2328"/>
+              </w:rPr>
+              <w:t xml:space="preserve">6'2" and under</w:t>
+            </w:r>
+          </w:p>
+        </w:tc>
+        <w:tc>
+          <w:tcPr>
+            <w:tcW w:type="dxa" w:w="7883"/>
+            <w:tcBorders>
+              <w:top w:val="single" w:color="D0D7DE" w:sz="4"/>
+              <w:left w:val="single" w:color="D0D7DE" w:sz="4"/>
+              <w:bottom w:val="single" w:color="D0D7DE" w:sz="4"/>
+              <w:right w:val="single" w:color="D0D7DE" w:sz="4"/>
+            </w:tcBorders>
+            <w:tcMar>
+              <w:top w:type="dxa" w:w="60"/>
+              <w:left w:type="dxa" w:w="100"/>
+              <w:bottom w:type="dxa" w:w="60"/>
+              <w:right w:type="dxa" w:w="100"/>
+            </w:tcMar>
+          </w:tcPr>
+          <w:p>
+            <w:pPr>
+              <w:jc w:val="left"/>
+            </w:pPr>
+            <w:r>
+              <w:rPr>
+                <w:rFonts w:ascii="Calibri" w:cs="Calibri" w:eastAsia="Calibri" w:hAnsi="Calibri"/>
+                <w:color w:val="1F2328"/>
+              </w:rPr>
+              <w:t xml:space="preserve">Handles for Days, Pick Pocket, Interceptor, Chasedown, Brick Wall</w:t>
+            </w:r>
+          </w:p>
+        </w:tc>
+      </w:tr>
+      <w:tr>
+        <w:trPr>
+          <w:cantSplit/>
+          <w:tblHeader w:val="false"/>
+        </w:trPr>
+        <w:tc>
+          <w:tcPr>
+            <w:tcW w:type="dxa" w:w="1477"/>
+            <w:tcBorders>
+              <w:top w:val="single" w:color="D0D7DE" w:sz="4"/>
+              <w:left w:val="single" w:color="D0D7DE" w:sz="4"/>
+              <w:bottom w:val="single" w:color="D0D7DE" w:sz="4"/>
+              <w:right w:val="single" w:color="D0D7DE" w:sz="4"/>
+            </w:tcBorders>
+            <w:tcMar>
+              <w:top w:type="dxa" w:w="60"/>
+              <w:left w:type="dxa" w:w="100"/>
+              <w:bottom w:type="dxa" w:w="60"/>
+              <w:right w:type="dxa" w:w="100"/>
+            </w:tcMar>
+          </w:tcPr>
+          <w:p>
+            <w:pPr>
+              <w:jc w:val="left"/>
+            </w:pPr>
+            <w:r>
+              <w:rPr>
+                <w:rFonts w:ascii="Calibri" w:cs="Calibri" w:eastAsia="Calibri" w:hAnsi="Calibri"/>
+                <w:color w:val="1F2328"/>
+              </w:rPr>
+              <w:t xml:space="preserve">6'3"–6'9"</w:t>
+            </w:r>
+          </w:p>
+        </w:tc>
+        <w:tc>
+          <w:tcPr>
+            <w:tcW w:type="dxa" w:w="7883"/>
+            <w:tcBorders>
+              <w:top w:val="single" w:color="D0D7DE" w:sz="4"/>
+              <w:left w:val="single" w:color="D0D7DE" w:sz="4"/>
+              <w:bottom w:val="single" w:color="D0D7DE" w:sz="4"/>
+              <w:right w:val="single" w:color="D0D7DE" w:sz="4"/>
+            </w:tcBorders>
+            <w:tcMar>
+              <w:top w:type="dxa" w:w="60"/>
+              <w:left w:type="dxa" w:w="100"/>
+              <w:bottom w:type="dxa" w:w="60"/>
+              <w:right w:type="dxa" w:w="100"/>
+            </w:tcMar>
+          </w:tcPr>
+          <w:p>
+            <w:pPr>
+              <w:jc w:val="left"/>
+            </w:pPr>
+            <w:r>
+              <w:rPr>
+                <w:rFonts w:ascii="Calibri" w:cs="Calibri" w:eastAsia="Calibri" w:hAnsi="Calibri"/>
+                <w:color w:val="1F2328"/>
+              </w:rPr>
+              <w:t xml:space="preserve">Handles for Days, Pick Pocket, Interceptor, Rim Protector, Chasedown, Brick Wall, Rebound Chaser</w:t>
+            </w:r>
+          </w:p>
+        </w:tc>
+      </w:tr>
+      <w:tr>
+        <w:trPr>
+          <w:cantSplit/>
+          <w:tblHeader w:val="false"/>
+        </w:trPr>
+        <w:tc>
+          <w:tcPr>
+            <w:tcW w:type="dxa" w:w="1477"/>
+            <w:tcBorders>
+              <w:top w:val="single" w:color="D0D7DE" w:sz="4"/>
+              <w:left w:val="single" w:color="D0D7DE" w:sz="4"/>
+              <w:bottom w:val="single" w:color="D0D7DE" w:sz="4"/>
+              <w:right w:val="single" w:color="D0D7DE" w:sz="4"/>
+            </w:tcBorders>
+            <w:tcMar>
+              <w:top w:type="dxa" w:w="60"/>
+              <w:left w:type="dxa" w:w="100"/>
+              <w:bottom w:type="dxa" w:w="60"/>
+              <w:right w:type="dxa" w:w="100"/>
+            </w:tcMar>
+          </w:tcPr>
+          <w:p>
+            <w:pPr>
+              <w:jc w:val="left"/>
+            </w:pPr>
+            <w:r>
+              <w:rPr>
+                <w:rFonts w:ascii="Calibri" w:cs="Calibri" w:eastAsia="Calibri" w:hAnsi="Calibri"/>
+                <w:color w:val="1F2328"/>
+              </w:rPr>
+              <w:t xml:space="preserve">6'10" and up</w:t>
+            </w:r>
+          </w:p>
+        </w:tc>
+        <w:tc>
+          <w:tcPr>
+            <w:tcW w:type="dxa" w:w="7883"/>
+            <w:tcBorders>
+              <w:top w:val="single" w:color="D0D7DE" w:sz="4"/>
+              <w:left w:val="single" w:color="D0D7DE" w:sz="4"/>
+              <w:bottom w:val="single" w:color="D0D7DE" w:sz="4"/>
+              <w:right w:val="single" w:color="D0D7DE" w:sz="4"/>
+            </w:tcBorders>
+            <w:tcMar>
+              <w:top w:type="dxa" w:w="60"/>
+              <w:left w:type="dxa" w:w="100"/>
+              <w:bottom w:type="dxa" w:w="60"/>
+              <w:right w:type="dxa" w:w="100"/>
+            </w:tcMar>
+          </w:tcPr>
+          <w:p>
+            <w:pPr>
+              <w:jc w:val="left"/>
+            </w:pPr>
+            <w:r>
+              <w:rPr>
+                <w:rFonts w:ascii="Calibri" w:cs="Calibri" w:eastAsia="Calibri" w:hAnsi="Calibri"/>
+                <w:color w:val="1F2328"/>
+              </w:rPr>
+              <w:t xml:space="preserve">Pick Pocket, Interceptor, Rim Protector, Chasedown, Brick Wall, Rebound Chaser</w:t>
+            </w:r>
+          </w:p>
+        </w:tc>
+      </w:tr>
+    </w:tbl>
+    <w:p>
+      <w:pPr>
+        <w:spacing w:after="80"/>
+      </w:pPr>
+    </w:p>
+    <w:p>
+      <w:pPr>
+        <w:spacing w:after="140" w:line="288"/>
+      </w:pPr>
+      <w:r>
+        <w:rPr>
+          <w:rFonts w:ascii="Calibri" w:cs="Calibri" w:eastAsia="Calibri" w:hAnsi="Calibri"/>
+          <w:color w:val="1F2328"/>
+        </w:rPr>
+        <w:t xml:space="preserve">Every Lockdown can still earn all 25 cap breakers. The Icon badge needs 7 Hall of Fame badges, or every one the build can reach if that's fewer.</w:t>
+      </w:r>
+    </w:p>
+    <w:p>
+      <w:pPr>
+        <w:spacing w:after="140" w:line="288"/>
+      </w:pPr>
+      <w:r>
+        <w:rPr>
+          <w:rFonts w:ascii="Calibri" w:cs="Calibri" w:eastAsia="Calibri" w:hAnsi="Calibri"/>
+          <w:b/>
+          <w:bCs/>
+          <w:color w:val="1F2328"/>
+        </w:rPr>
+        <w:t xml:space="preserve">Lockdowns that already had Gold or Hall of Fame shooting badges</w:t>
+      </w:r>
+      <w:r>
+        <w:rPr>
+          <w:rFonts w:ascii="Calibri" w:cs="Calibri" w:eastAsia="Calibri" w:hAnsi="Calibri"/>
+          <w:color w:val="1F2328"/>
+        </w:rPr>
+        <w:t xml:space="preserve"> have them lowered to Silver the next time the game loads your profile. It says so when you sign in. Your progress on those badges is kept, and:</w:t>
+      </w:r>
+    </w:p>
+    <w:p>
+      <w:pPr>
+        <w:pStyle w:val="ListParagraph"/>
+        <w:numPr>
+          <w:ilvl w:val="0"/>
+          <w:numId w:val="2"/>
+        </w:numPr>
+        <w:spacing w:after="80" w:line="276"/>
+      </w:pPr>
+      <w:r>
+        <w:rPr>
+          <w:rFonts w:ascii="Calibri" w:cs="Calibri" w:eastAsia="Calibri" w:hAnsi="Calibri"/>
+          <w:color w:val="1F2328"/>
+        </w:rPr>
+        <w:t xml:space="preserve">the cap breakers you've already earned stay yours;</w:t>
+      </w:r>
+    </w:p>
+    <w:p>
+      <w:pPr>
+        <w:pStyle w:val="ListParagraph"/>
+        <w:numPr>
+          <w:ilvl w:val="0"/>
+          <w:numId w:val="2"/>
+        </w:numPr>
+        <w:spacing w:after="80" w:line="276"/>
+      </w:pPr>
+      <w:r>
+        <w:rPr>
+          <w:rFonts w:ascii="Calibri" w:cs="Calibri" w:eastAsia="Calibri" w:hAnsi="Calibri"/>
+          <w:color w:val="1F2328"/>
+        </w:rPr>
+        <w:t xml:space="preserve">an Icon badge you've already unlocked stays unlocked;</w:t>
+      </w:r>
+    </w:p>
+    <w:p>
+      <w:pPr>
+        <w:pStyle w:val="ListParagraph"/>
+        <w:numPr>
+          <w:ilvl w:val="0"/>
+          <w:numId w:val="2"/>
+        </w:numPr>
+        <w:spacing w:after="80" w:line="276"/>
+      </w:pPr>
+      <w:r>
+        <w:rPr>
+          <w:rFonts w:ascii="Calibri" w:cs="Calibri" w:eastAsia="Calibri" w:hAnsi="Calibri"/>
+          <w:color w:val="1F2328"/>
+        </w:rPr>
+        <w:t xml:space="preserve">your new defensive Hall of Fame badges never pay cap breakers twice: 25 is still the most a build earns.</w:t>
+      </w:r>
+    </w:p>
+    <w:p>
+      <w:pPr>
+        <w:spacing w:after="140" w:line="288"/>
+      </w:pPr>
+      <w:r>
+        <w:rPr>
+          <w:rFonts w:ascii="Calibri" w:cs="Calibri" w:eastAsia="Calibri" w:hAnsi="Calibri"/>
+          <w:color w:val="1F2328"/>
+        </w:rPr>
+        <w:t xml:space="preserve">AI Lockdowns follow the same caps.</w:t>
+      </w:r>
+    </w:p>
+    <w:p>
+      <w:pPr>
+        <w:pBdr>
+          <w:bottom w:val="single" w:color="D0D7DE" w:sz="4" w:space="1"/>
+        </w:pBdr>
+        <w:spacing w:after="160" w:before="80"/>
+      </w:pPr>
+    </w:p>
+    <w:p>
+      <w:pPr>
+        <w:pStyle w:val="Heading1"/>
+        <w:spacing w:after="120" w:before="280"/>
+      </w:pPr>
+      <w:r>
+        <w:rPr>
+          <w:rFonts w:ascii="Calibri" w:cs="Calibri" w:eastAsia="Calibri" w:hAnsi="Calibri"/>
+          <w:b/>
+          <w:bCs/>
+          <w:color w:val="C8102E"/>
+          <w:sz w:val="32"/>
+          <w:szCs w:val="32"/>
+        </w:rPr>
+        <w:t xml:space="preserve">Quick patch 2 (Oct 21): No walking onto a game in progress</w:t>
+      </w:r>
+    </w:p>
+    <w:p>
+      <w:pPr>
+        <w:spacing w:after="140" w:line="288"/>
+      </w:pPr>
+      <w:r>
+        <w:rPr>
+          <w:rFonts w:ascii="Calibri" w:cs="Calibri" w:eastAsia="Calibri" w:hAnsi="Calibri"/>
+          <w:b/>
+          <w:bCs/>
+          <w:color w:val="1F2328"/>
+        </w:rPr>
+        <w:t xml:space="preserve">Real players can't walk onto a court while a game is being played there</w:t>
+      </w:r>
+      <w:r>
+        <w:rPr>
+          <w:rFonts w:ascii="Calibri" w:cs="Calibri" w:eastAsia="Calibri" w:hAnsi="Calibri"/>
+          <w:color w:val="1F2328"/>
+        </w:rPr>
+        <w:t xml:space="preserve">, just as the park-goers can't. That covers AI games, the game you're watching, and other real players' games. Walking toward one, you stop at the court's edge. If you're standing on a court when a game starts, you're walked off to the nearest sideline at a walking pace, without a jump across the court. You can still walk onto an empty court, stand on your Got Next spot, and go onto the court of your own game. Your position goes out to everyone else's screen too, so nobody wanders through anyone's game.</w:t>
+      </w:r>
+    </w:p>
+    <w:p>
+      <w:pPr>
+        <w:pBdr>
+          <w:bottom w:val="single" w:color="D0D7DE" w:sz="4" w:space="1"/>
+        </w:pBdr>
+        <w:spacing w:after="160" w:before="80"/>
+      </w:pPr>
+    </w:p>
+    <w:p>
+      <w:pPr>
+        <w:pStyle w:val="Heading1"/>
+        <w:spacing w:after="120" w:before="280"/>
+      </w:pPr>
+      <w:r>
+        <w:rPr>
+          <w:rFonts w:ascii="Calibri" w:cs="Calibri" w:eastAsia="Calibri" w:hAnsi="Calibri"/>
+          <w:b/>
+          <w:bCs/>
+          <w:color w:val="C8102E"/>
+          <w:sz w:val="32"/>
+          <w:szCs w:val="32"/>
+        </w:rPr>
+        <w:t xml:space="preserve">Quick patch 3 (Oct 21): Green layups go in</w:t>
+      </w:r>
+    </w:p>
+    <w:p>
+      <w:pPr>
+        <w:spacing w:after="140" w:line="288"/>
+      </w:pPr>
+      <w:r>
+        <w:rPr>
+          <w:rFonts w:ascii="Calibri" w:cs="Calibri" w:eastAsia="Calibri" w:hAnsi="Calibri"/>
+          <w:b/>
+          <w:bCs/>
+          <w:color w:val="1F2328"/>
+        </w:rPr>
+        <w:t xml:space="preserve">A perfectly timed open layup no longer hits the underside of the rim.</w:t>
+      </w:r>
+      <w:r>
+        <w:rPr>
+          <w:rFonts w:ascii="Calibri" w:cs="Calibri" w:eastAsia="Calibri" w:hAnsi="Calibri"/>
+          <w:color w:val="1F2328"/>
+        </w:rPr>
+        <w:t xml:space="preserve"> Before, a layup started right at the end of a drive (under the rim), or let go late, could carry the shooter in under the rim. The ball then came out below the front of the rim and hit its underside, even on a green.</w:t>
+      </w:r>
+    </w:p>
+    <w:p>
+      <w:pPr>
+        <w:pStyle w:val="ListParagraph"/>
+        <w:numPr>
+          <w:ilvl w:val="0"/>
+          <w:numId w:val="2"/>
+        </w:numPr>
+        <w:spacing w:after="80" w:line="276"/>
+      </w:pPr>
+      <w:r>
+        <w:rPr>
+          <w:rFonts w:ascii="Calibri" w:cs="Calibri" w:eastAsia="Calibri" w:hAnsi="Calibri"/>
+          <w:b/>
+          <w:bCs/>
+          <w:color w:val="1F2328"/>
+        </w:rPr>
+        <w:t xml:space="preserve">While you still have the ball in the air, you stay at the finishing distance from the rim.</w:t>
+      </w:r>
+      <w:r>
+        <w:rPr>
+          <w:rFonts w:ascii="Calibri" w:cs="Calibri" w:eastAsia="Calibri" w:hAnsi="Calibri"/>
+          <w:color w:val="1F2328"/>
+        </w:rPr>
+        <w:t xml:space="preserve"> You no longer drift in under it.</w:t>
+      </w:r>
+    </w:p>
+    <w:p>
+      <w:pPr>
+        <w:pStyle w:val="ListParagraph"/>
+        <w:numPr>
+          <w:ilvl w:val="0"/>
+          <w:numId w:val="2"/>
+        </w:numPr>
+        <w:spacing w:after="80" w:line="276"/>
+      </w:pPr>
+      <w:r>
+        <w:rPr>
+          <w:rFonts w:ascii="Calibri" w:cs="Calibri" w:eastAsia="Calibri" w:hAnsi="Calibri"/>
+          <w:b/>
+          <w:bCs/>
+          <w:color w:val="1F2328"/>
+        </w:rPr>
+        <w:t xml:space="preserve">A layup started right under the rim</w:t>
+      </w:r>
+      <w:r>
+        <w:rPr>
+          <w:rFonts w:ascii="Calibri" w:cs="Calibri" w:eastAsia="Calibri" w:hAnsi="Calibri"/>
+          <w:color w:val="1F2328"/>
+        </w:rPr>
+        <w:t xml:space="preserve"> glides on through and finishes from the other side, like a reverse.</w:t>
+      </w:r>
+    </w:p>
+    <w:p>
+      <w:pPr>
+        <w:pStyle w:val="ListParagraph"/>
+        <w:numPr>
+          <w:ilvl w:val="0"/>
+          <w:numId w:val="2"/>
+        </w:numPr>
+        <w:spacing w:after="80" w:line="276"/>
+      </w:pPr>
+      <w:r>
+        <w:rPr>
+          <w:rFonts w:ascii="Calibri" w:cs="Calibri" w:eastAsia="Calibri" w:hAnsi="Calibri"/>
+          <w:b/>
+          <w:bCs/>
+          <w:color w:val="1F2328"/>
+        </w:rPr>
+        <w:t xml:space="preserve">The game no longer counts a ball that hits the rim from underneath as a make</w:t>
+      </w:r>
+      <w:r>
+        <w:rPr>
+          <w:rFonts w:ascii="Calibri" w:cs="Calibri" w:eastAsia="Calibri" w:hAnsi="Calibri"/>
+          <w:color w:val="1F2328"/>
+        </w:rPr>
+        <w:t xml:space="preserve"> when it plans a shot's path. It also plans with the spin the ball really has, so the path it plans is the path the ball takes.</w:t>
+      </w:r>
+    </w:p>
+    <w:p>
+      <w:pPr>
+        <w:pStyle w:val="ListParagraph"/>
+        <w:numPr>
+          <w:ilvl w:val="0"/>
+          <w:numId w:val="2"/>
+        </w:numPr>
+        <w:spacing w:after="80" w:line="276"/>
+      </w:pPr>
+      <w:r>
+        <w:rPr>
+          <w:rFonts w:ascii="Calibri" w:cs="Calibri" w:eastAsia="Calibri" w:hAnsi="Calibri"/>
+          <w:b/>
+          <w:bCs/>
+          <w:color w:val="1F2328"/>
+        </w:rPr>
+        <w:t xml:space="preserve">A green with no clean path goes through the rim</w:t>
+      </w:r>
+      <w:r>
+        <w:rPr>
+          <w:rFonts w:ascii="Calibri" w:cs="Calibri" w:eastAsia="Calibri" w:hAnsi="Calibri"/>
+          <w:color w:val="1F2328"/>
+        </w:rPr>
+        <w:t xml:space="preserve"> the way a green jumper does.</w:t>
+      </w:r>
+    </w:p>
+    <w:p>
+      <w:pPr>
+        <w:spacing w:after="140" w:line="288"/>
+      </w:pPr>
+      <w:r>
+        <w:rPr>
+          <w:rFonts w:ascii="Calibri" w:cs="Calibri" w:eastAsia="Calibri" w:hAnsi="Calibri"/>
+          <w:color w:val="1F2328"/>
+        </w:rPr>
+        <w:t xml:space="preserve">In testing, 960 out of 960 open green layups went in, from every distance out to 2.6 m, at every speed and with every release timing.</w:t>
+      </w:r>
+    </w:p>
+    <w:p>
+      <w:pPr>
+        <w:pStyle w:val="Heading1"/>
+        <w:spacing w:after="120" w:before="280"/>
+      </w:pPr>
+      <w:r>
+        <w:rPr>
+          <w:rFonts w:ascii="Calibri" w:cs="Calibri" w:eastAsia="Calibri" w:hAnsi="Calibri"/>
+          <w:b/>
+          <w:bCs/>
+          <w:color w:val="C8102E"/>
+          <w:sz w:val="32"/>
+          <w:szCs w:val="32"/>
+        </w:rPr>
+        <w:t xml:space="preserve">Quick patch 4 (Oct 21): Watch other players' games, and the right badge tiers</w:t>
+      </w:r>
+    </w:p>
+    <w:p>
+      <w:pPr>
+        <w:spacing w:after="140" w:line="288"/>
+      </w:pPr>
+      <w:r>
+        <w:rPr>
+          <w:rFonts w:ascii="Calibri" w:cs="Calibri" w:eastAsia="Calibri" w:hAnsi="Calibri"/>
+          <w:b/>
+          <w:bCs/>
+          <w:color w:val="1F2328"/>
+        </w:rPr>
+        <w:t xml:space="preserve">You can see other players' park games while they're being played</w:t>
+      </w:r>
+      <w:r>
+        <w:rPr>
+          <w:rFonts w:ascii="Calibri" w:cs="Calibri" w:eastAsia="Calibri" w:hAnsi="Calibri"/>
+          <w:color w:val="1F2328"/>
+        </w:rPr>
+        <w:t xml:space="preserve">, models and all.</w:t>
+      </w:r>
+    </w:p>
+    <w:p>
+      <w:pPr>
+        <w:pStyle w:val="ListParagraph"/>
+        <w:numPr>
+          <w:ilvl w:val="0"/>
+          <w:numId w:val="2"/>
+        </w:numPr>
+        <w:spacing w:after="80" w:line="276"/>
+      </w:pPr>
+      <w:r>
+        <w:rPr>
+          <w:rFonts w:ascii="Calibri" w:cs="Calibri" w:eastAsia="Calibri" w:hAnsi="Calibri"/>
+          <w:b/>
+          <w:bCs/>
+          <w:color w:val="1F2328"/>
+        </w:rPr>
+        <w:t xml:space="preserve">Arriving after the first minute:</w:t>
+      </w:r>
+      <w:r>
+        <w:rPr>
+          <w:rFonts w:ascii="Calibri" w:cs="Calibri" w:eastAsia="Calibri" w:hAnsi="Calibri"/>
+          <w:color w:val="1F2328"/>
+        </w:rPr>
+        <w:t xml:space="preserve"> before, anyone arriving at the park after a game's first minute saw an empty court until it ended. Now you see the game from wherever it's got to: your screen catches up in a few seconds, then plays along live.</w:t>
+      </w:r>
+    </w:p>
+    <w:p>
+      <w:pPr>
+        <w:pStyle w:val="ListParagraph"/>
+        <w:numPr>
+          <w:ilvl w:val="0"/>
+          <w:numId w:val="2"/>
+        </w:numPr>
+        <w:spacing w:after="80" w:line="276"/>
+      </w:pPr>
+      <w:r>
+        <w:rPr>
+          <w:rFonts w:ascii="Calibri" w:cs="Calibri" w:eastAsia="Calibri" w:hAnsi="Calibri"/>
+          <w:b/>
+          <w:bCs/>
+          <w:color w:val="1F2328"/>
+        </w:rPr>
+        <w:t xml:space="preserve">A player's own game:</w:t>
+      </w:r>
+      <w:r>
+        <w:rPr>
+          <w:rFonts w:ascii="Calibri" w:cs="Calibri" w:eastAsia="Calibri" w:hAnsi="Calibri"/>
+          <w:color w:val="1F2328"/>
+        </w:rPr>
+        <w:t xml:space="preserve"> a player's own game (with AI teammates, against AI) now shows on everyone else's screen too, even if he started it before they arrived.</w:t>
+      </w:r>
+    </w:p>
+    <w:p>
+      <w:pPr>
+        <w:pStyle w:val="ListParagraph"/>
+        <w:numPr>
+          <w:ilvl w:val="0"/>
+          <w:numId w:val="2"/>
+        </w:numPr>
+        <w:spacing w:after="80" w:line="276"/>
+      </w:pPr>
+      <w:r>
+        <w:rPr>
+          <w:rFonts w:ascii="Calibri" w:cs="Calibri" w:eastAsia="Calibri" w:hAnsi="Calibri"/>
+          <w:b/>
+          <w:bCs/>
+          <w:color w:val="1F2328"/>
+        </w:rPr>
+        <w:t xml:space="preserve">No extra delay:</w:t>
+      </w:r>
+      <w:r>
+        <w:rPr>
+          <w:rFonts w:ascii="Calibri" w:cs="Calibri" w:eastAsia="Calibri" w:hAnsi="Calibri"/>
+          <w:color w:val="1F2328"/>
+        </w:rPr>
+        <w:t xml:space="preserve"> watching never affects the game, its result or its players' delay.</w:t>
+      </w:r>
+    </w:p>
+    <w:p>
+      <w:pPr>
+        <w:spacing w:after="140" w:line="288"/>
+      </w:pPr>
+      <w:r>
+        <w:rPr>
+          <w:rFonts w:ascii="Calibri" w:cs="Calibri" w:eastAsia="Calibri" w:hAnsi="Calibri"/>
+          <w:b/>
+          <w:bCs/>
+          <w:color w:val="1F2328"/>
+        </w:rPr>
+        <w:t xml:space="preserve">Activated badges show your real tier.</w:t>
+      </w:r>
+      <w:r>
+        <w:rPr>
+          <w:rFonts w:ascii="Calibri" w:cs="Calibri" w:eastAsia="Calibri" w:hAnsi="Calibri"/>
+          <w:color w:val="1F2328"/>
+        </w:rPr>
+        <w:t xml:space="preserve"> Online, your badges were only sent again when something else about your build changed. So after a badge upgrade, the next games could still show (and play) your old tier. Now a badge tier change goes out at once, for you and your AI squad mates.</w:t>
+      </w:r>
+    </w:p>
+    <w:p>
+      <w:pPr>
+        <w:pStyle w:val="Heading1"/>
+        <w:spacing w:after="120" w:before="280"/>
+      </w:pPr>
+      <w:r>
+        <w:rPr>
+          <w:rFonts w:ascii="Calibri" w:cs="Calibri" w:eastAsia="Calibri" w:hAnsi="Calibri"/>
+          <w:b/>
+          <w:bCs/>
+          <w:color w:val="C8102E"/>
+          <w:sz w:val="32"/>
+          <w:szCs w:val="32"/>
+        </w:rPr>
+        <w:t xml:space="preserve">Quick patch 5 (Oct 21): Auto-play in online Pro-Am</w:t>
+      </w:r>
+    </w:p>
+    <w:p>
+      <w:pPr>
+        <w:spacing w:after="140" w:line="288"/>
+      </w:pPr>
+      <w:r>
+        <w:rPr>
+          <w:rFonts w:ascii="Calibri" w:cs="Calibri" w:eastAsia="Calibri" w:hAnsi="Calibri"/>
+          <w:b/>
+          <w:bCs/>
+          <w:color w:val="1F2328"/>
+        </w:rPr>
+        <w:t xml:space="preserve">Auto-play now works in online Pro-Am</w:t>
+      </w:r>
+      <w:r>
+        <w:rPr>
+          <w:rFonts w:ascii="Calibri" w:cs="Calibri" w:eastAsia="Calibri" w:hAnsi="Calibri"/>
+          <w:color w:val="1F2328"/>
+        </w:rPr>
+        <w:t xml:space="preserve">, so you can take a break in a long Pro-Am grind and keep playing.</w:t>
+      </w:r>
+    </w:p>
+    <w:p>
+      <w:pPr>
+        <w:pStyle w:val="ListParagraph"/>
+        <w:numPr>
+          <w:ilvl w:val="0"/>
+          <w:numId w:val="2"/>
+        </w:numPr>
+        <w:spacing w:after="80" w:line="276"/>
+      </w:pPr>
+      <w:r>
+        <w:rPr>
+          <w:rFonts w:ascii="Calibri" w:cs="Calibri" w:eastAsia="Calibri" w:hAnsi="Calibri"/>
+          <w:b/>
+          <w:bCs/>
+          <w:color w:val="1F2328"/>
+        </w:rPr>
+        <w:t xml:space="preserve">Turning it on and off:</w:t>
+      </w:r>
+      <w:r>
+        <w:rPr>
+          <w:rFonts w:ascii="Calibri" w:cs="Calibri" w:eastAsia="Calibri" w:hAnsi="Calibri"/>
+          <w:color w:val="1F2328"/>
+        </w:rPr>
+        <w:t xml:space="preserve"> press H to turn it on, and H again to take back control.</w:t>
+      </w:r>
+    </w:p>
+    <w:p>
+      <w:pPr>
+        <w:pStyle w:val="ListParagraph"/>
+        <w:numPr>
+          <w:ilvl w:val="0"/>
+          <w:numId w:val="2"/>
+        </w:numPr>
+        <w:spacing w:after="80" w:line="276"/>
+      </w:pPr>
+      <w:r>
+        <w:rPr>
+          <w:rFonts w:ascii="Calibri" w:cs="Calibri" w:eastAsia="Calibri" w:hAnsi="Calibri"/>
+          <w:b/>
+          <w:bCs/>
+          <w:color w:val="1F2328"/>
+        </w:rPr>
+        <w:t xml:space="preserve">Everyone sees it:</w:t>
+      </w:r>
+      <w:r>
+        <w:rPr>
+          <w:rFonts w:ascii="Calibri" w:cs="Calibri" w:eastAsia="Calibri" w:hAnsi="Calibri"/>
+          <w:color w:val="1F2328"/>
+        </w:rPr>
+        <w:t xml:space="preserve"> your player is played by the AI the same way on every screen, and your name shows </w:t>
+      </w:r>
+      <w:r>
+        <w:rPr>
+          <w:rFonts w:ascii="Calibri" w:cs="Calibri" w:eastAsia="Calibri" w:hAnsi="Calibri"/>
+          <w:b/>
+          <w:bCs/>
+          <w:color w:val="1F2328"/>
+        </w:rPr>
+        <w:t xml:space="preserve">AUTO</w:t>
+      </w:r>
+      <w:r>
+        <w:rPr>
+          <w:rFonts w:ascii="Calibri" w:cs="Calibri" w:eastAsia="Calibri" w:hAnsi="Calibri"/>
+          <w:color w:val="1F2328"/>
+        </w:rPr>
+        <w:t xml:space="preserve"> to the others.</w:t>
+      </w:r>
+    </w:p>
+    <w:p>
+      <w:pPr>
+        <w:pStyle w:val="ListParagraph"/>
+        <w:numPr>
+          <w:ilvl w:val="0"/>
+          <w:numId w:val="2"/>
+        </w:numPr>
+        <w:spacing w:after="80" w:line="276"/>
+      </w:pPr>
+      <w:r>
+        <w:rPr>
+          <w:rFonts w:ascii="Calibri" w:cs="Calibri" w:eastAsia="Calibri" w:hAnsi="Calibri"/>
+          <w:b/>
+          <w:bCs/>
+          <w:color w:val="1F2328"/>
+        </w:rPr>
+        <w:t xml:space="preserve">Next game:</w:t>
+      </w:r>
+      <w:r>
+        <w:rPr>
+          <w:rFonts w:ascii="Calibri" w:cs="Calibri" w:eastAsia="Calibri" w:hAnsi="Calibri"/>
+          <w:color w:val="1F2328"/>
+        </w:rPr>
+        <w:t xml:space="preserve"> auto-play stays on for your next online Pro-Am game, as it does offline. H always turns it off.</w:t>
+      </w:r>
+    </w:p>
+    <w:p>
+      <w:pPr>
+        <w:pStyle w:val="ListParagraph"/>
+        <w:numPr>
+          <w:ilvl w:val="0"/>
+          <w:numId w:val="2"/>
+        </w:numPr>
+        <w:spacing w:after="80" w:line="276"/>
+      </w:pPr>
+      <w:r>
+        <w:rPr>
+          <w:rFonts w:ascii="Calibri" w:cs="Calibri" w:eastAsia="Calibri" w:hAnsi="Calibri"/>
+          <w:b/>
+          <w:bCs/>
+          <w:color w:val="1F2328"/>
+        </w:rPr>
+        <w:t xml:space="preserve">Rewards:</w:t>
+      </w:r>
+      <w:r>
+        <w:rPr>
+          <w:rFonts w:ascii="Calibri" w:cs="Calibri" w:eastAsia="Calibri" w:hAnsi="Calibri"/>
+          <w:color w:val="1F2328"/>
+        </w:rPr>
+        <w:t xml:space="preserve"> it pays exactly the same as offline auto-play.</w:t>
+      </w:r>
+    </w:p>
+    <w:p>
+      <w:pPr>
+        <w:pStyle w:val="ListParagraph"/>
+        <w:numPr>
+          <w:ilvl w:val="0"/>
+          <w:numId w:val="2"/>
+        </w:numPr>
+        <w:spacing w:after="80" w:line="276"/>
+      </w:pPr>
+      <w:r>
+        <w:rPr>
+          <w:rFonts w:ascii="Calibri" w:cs="Calibri" w:eastAsia="Calibri" w:hAnsi="Calibri"/>
+          <w:b/>
+          <w:bCs/>
+          <w:color w:val="1F2328"/>
+        </w:rPr>
+        <w:t xml:space="preserve">Other online games:</w:t>
+      </w:r>
+      <w:r>
+        <w:rPr>
+          <w:rFonts w:ascii="Calibri" w:cs="Calibri" w:eastAsia="Calibri" w:hAnsi="Calibri"/>
+          <w:color w:val="1F2328"/>
+        </w:rPr>
+        <w:t xml:space="preserve"> online park and other online games still don't allow it ("Auto-play is only in online Pro-Am").</w:t>
       </w:r>
     </w:p>
     <w:sectPr>

</xml_diff>

<commit_message>
Lower steal badge thresholds
Reduce Pick Pocket and Interceptor steal requirements by 30%. Existing progress now earns newly reached tiers on profile load, with tests and patch notes updated.
</commit_message>
<xml_diff>
--- a/PATCH_NOTES_v0.4.8.7.docx
+++ b/PATCH_NOTES_v0.4.8.7.docx
@@ -1633,6 +1633,542 @@
         <w:t xml:space="preserve"> online park and other online games still don't allow it ("Auto-play is only in online Pro-Am").</w:t>
       </w:r>
     </w:p>
+    <w:p>
+      <w:pPr>
+        <w:pStyle w:val="Heading1"/>
+        <w:spacing w:after="120" w:before="280"/>
+      </w:pPr>
+      <w:r>
+        <w:rPr>
+          <w:rFonts w:ascii="Calibri" w:cs="Calibri" w:eastAsia="Calibri" w:hAnsi="Calibri"/>
+          <w:b/>
+          <w:bCs/>
+          <w:color w:val="C8102E"/>
+          <w:sz w:val="32"/>
+          <w:szCs w:val="32"/>
+        </w:rPr>
+        <w:t xml:space="preserve">Quick patch 6 (Oct 21): Steal badges come quicker</w:t>
+      </w:r>
+    </w:p>
+    <w:p>
+      <w:pPr>
+        <w:spacing w:after="140" w:line="288"/>
+      </w:pPr>
+      <w:r>
+        <w:rPr>
+          <w:rFonts w:ascii="Calibri" w:cs="Calibri" w:eastAsia="Calibri" w:hAnsi="Calibri"/>
+          <w:b/>
+          <w:bCs/>
+          <w:color w:val="1F2328"/>
+        </w:rPr>
+        <w:t xml:space="preserve">Pick Pocket and Interceptor need 30% fewer steals at every tier.</w:t>
+      </w:r>
+    </w:p>
+    <w:tbl>
+      <w:tblPr>
+        <w:tblW w:type="dxa" w:w="9360"/>
+        <w:tblBorders>
+          <w:top w:val="single" w:color="auto" w:sz="4"/>
+          <w:left w:val="single" w:color="auto" w:sz="4"/>
+          <w:bottom w:val="single" w:color="auto" w:sz="4"/>
+          <w:right w:val="single" w:color="auto" w:sz="4"/>
+          <w:insideH w:val="single" w:color="auto" w:sz="4"/>
+          <w:insideV w:val="single" w:color="auto" w:sz="4"/>
+        </w:tblBorders>
+      </w:tblPr>
+      <w:tblGrid>
+        <w:gridCol w:w="2995"/>
+        <w:gridCol w:w="1591"/>
+        <w:gridCol w:w="1591"/>
+        <w:gridCol w:w="1591"/>
+        <w:gridCol w:w="1592"/>
+      </w:tblGrid>
+      <w:tr>
+        <w:trPr>
+          <w:cantSplit/>
+          <w:tblHeader/>
+        </w:trPr>
+        <w:tc>
+          <w:tcPr>
+            <w:tcW w:type="dxa" w:w="2995"/>
+            <w:tcBorders>
+              <w:top w:val="single" w:color="D0D7DE" w:sz="4"/>
+              <w:left w:val="single" w:color="D0D7DE" w:sz="4"/>
+              <w:bottom w:val="single" w:color="D0D7DE" w:sz="4"/>
+              <w:right w:val="single" w:color="D0D7DE" w:sz="4"/>
+            </w:tcBorders>
+            <w:shd w:fill="F3E3E6" w:color="auto" w:val="clear"/>
+            <w:tcMar>
+              <w:top w:type="dxa" w:w="60"/>
+              <w:left w:type="dxa" w:w="100"/>
+              <w:bottom w:type="dxa" w:w="60"/>
+              <w:right w:type="dxa" w:w="100"/>
+            </w:tcMar>
+          </w:tcPr>
+          <w:p>
+            <w:pPr>
+              <w:jc w:val="left"/>
+            </w:pPr>
+            <w:r>
+              <w:rPr>
+                <w:rFonts w:ascii="Calibri" w:cs="Calibri" w:eastAsia="Calibri" w:hAnsi="Calibri"/>
+                <w:b/>
+                <w:bCs/>
+                <w:color w:val="1F2328"/>
+              </w:rPr>
+              <w:t xml:space="preserve">Badge</w:t>
+            </w:r>
+          </w:p>
+        </w:tc>
+        <w:tc>
+          <w:tcPr>
+            <w:tcW w:type="dxa" w:w="1591"/>
+            <w:tcBorders>
+              <w:top w:val="single" w:color="D0D7DE" w:sz="4"/>
+              <w:left w:val="single" w:color="D0D7DE" w:sz="4"/>
+              <w:bottom w:val="single" w:color="D0D7DE" w:sz="4"/>
+              <w:right w:val="single" w:color="D0D7DE" w:sz="4"/>
+            </w:tcBorders>
+            <w:shd w:fill="F3E3E6" w:color="auto" w:val="clear"/>
+            <w:tcMar>
+              <w:top w:type="dxa" w:w="60"/>
+              <w:left w:type="dxa" w:w="100"/>
+              <w:bottom w:type="dxa" w:w="60"/>
+              <w:right w:type="dxa" w:w="100"/>
+            </w:tcMar>
+          </w:tcPr>
+          <w:p>
+            <w:pPr>
+              <w:jc w:val="center"/>
+            </w:pPr>
+            <w:r>
+              <w:rPr>
+                <w:rFonts w:ascii="Calibri" w:cs="Calibri" w:eastAsia="Calibri" w:hAnsi="Calibri"/>
+                <w:b/>
+                <w:bCs/>
+                <w:color w:val="1F2328"/>
+              </w:rPr>
+              <w:t xml:space="preserve">Bronze</w:t>
+            </w:r>
+          </w:p>
+        </w:tc>
+        <w:tc>
+          <w:tcPr>
+            <w:tcW w:type="dxa" w:w="1591"/>
+            <w:tcBorders>
+              <w:top w:val="single" w:color="D0D7DE" w:sz="4"/>
+              <w:left w:val="single" w:color="D0D7DE" w:sz="4"/>
+              <w:bottom w:val="single" w:color="D0D7DE" w:sz="4"/>
+              <w:right w:val="single" w:color="D0D7DE" w:sz="4"/>
+            </w:tcBorders>
+            <w:shd w:fill="F3E3E6" w:color="auto" w:val="clear"/>
+            <w:tcMar>
+              <w:top w:type="dxa" w:w="60"/>
+              <w:left w:type="dxa" w:w="100"/>
+              <w:bottom w:type="dxa" w:w="60"/>
+              <w:right w:type="dxa" w:w="100"/>
+            </w:tcMar>
+          </w:tcPr>
+          <w:p>
+            <w:pPr>
+              <w:jc w:val="center"/>
+            </w:pPr>
+            <w:r>
+              <w:rPr>
+                <w:rFonts w:ascii="Calibri" w:cs="Calibri" w:eastAsia="Calibri" w:hAnsi="Calibri"/>
+                <w:b/>
+                <w:bCs/>
+                <w:color w:val="1F2328"/>
+              </w:rPr>
+              <w:t xml:space="preserve">Silver</w:t>
+            </w:r>
+          </w:p>
+        </w:tc>
+        <w:tc>
+          <w:tcPr>
+            <w:tcW w:type="dxa" w:w="1591"/>
+            <w:tcBorders>
+              <w:top w:val="single" w:color="D0D7DE" w:sz="4"/>
+              <w:left w:val="single" w:color="D0D7DE" w:sz="4"/>
+              <w:bottom w:val="single" w:color="D0D7DE" w:sz="4"/>
+              <w:right w:val="single" w:color="D0D7DE" w:sz="4"/>
+            </w:tcBorders>
+            <w:shd w:fill="F3E3E6" w:color="auto" w:val="clear"/>
+            <w:tcMar>
+              <w:top w:type="dxa" w:w="60"/>
+              <w:left w:type="dxa" w:w="100"/>
+              <w:bottom w:type="dxa" w:w="60"/>
+              <w:right w:type="dxa" w:w="100"/>
+            </w:tcMar>
+          </w:tcPr>
+          <w:p>
+            <w:pPr>
+              <w:jc w:val="center"/>
+            </w:pPr>
+            <w:r>
+              <w:rPr>
+                <w:rFonts w:ascii="Calibri" w:cs="Calibri" w:eastAsia="Calibri" w:hAnsi="Calibri"/>
+                <w:b/>
+                <w:bCs/>
+                <w:color w:val="1F2328"/>
+              </w:rPr>
+              <w:t xml:space="preserve">Gold</w:t>
+            </w:r>
+          </w:p>
+        </w:tc>
+        <w:tc>
+          <w:tcPr>
+            <w:tcW w:type="dxa" w:w="1592"/>
+            <w:tcBorders>
+              <w:top w:val="single" w:color="D0D7DE" w:sz="4"/>
+              <w:left w:val="single" w:color="D0D7DE" w:sz="4"/>
+              <w:bottom w:val="single" w:color="D0D7DE" w:sz="4"/>
+              <w:right w:val="single" w:color="D0D7DE" w:sz="4"/>
+            </w:tcBorders>
+            <w:shd w:fill="F3E3E6" w:color="auto" w:val="clear"/>
+            <w:tcMar>
+              <w:top w:type="dxa" w:w="60"/>
+              <w:left w:type="dxa" w:w="100"/>
+              <w:bottom w:type="dxa" w:w="60"/>
+              <w:right w:type="dxa" w:w="100"/>
+            </w:tcMar>
+          </w:tcPr>
+          <w:p>
+            <w:pPr>
+              <w:jc w:val="center"/>
+            </w:pPr>
+            <w:r>
+              <w:rPr>
+                <w:rFonts w:ascii="Calibri" w:cs="Calibri" w:eastAsia="Calibri" w:hAnsi="Calibri"/>
+                <w:b/>
+                <w:bCs/>
+                <w:color w:val="1F2328"/>
+              </w:rPr>
+              <w:t xml:space="preserve">Hall of Fame</w:t>
+            </w:r>
+          </w:p>
+        </w:tc>
+      </w:tr>
+      <w:tr>
+        <w:trPr>
+          <w:cantSplit/>
+          <w:tblHeader w:val="false"/>
+        </w:trPr>
+        <w:tc>
+          <w:tcPr>
+            <w:tcW w:type="dxa" w:w="2995"/>
+            <w:tcBorders>
+              <w:top w:val="single" w:color="D0D7DE" w:sz="4"/>
+              <w:left w:val="single" w:color="D0D7DE" w:sz="4"/>
+              <w:bottom w:val="single" w:color="D0D7DE" w:sz="4"/>
+              <w:right w:val="single" w:color="D0D7DE" w:sz="4"/>
+            </w:tcBorders>
+            <w:tcMar>
+              <w:top w:type="dxa" w:w="60"/>
+              <w:left w:type="dxa" w:w="100"/>
+              <w:bottom w:type="dxa" w:w="60"/>
+              <w:right w:type="dxa" w:w="100"/>
+            </w:tcMar>
+          </w:tcPr>
+          <w:p>
+            <w:pPr>
+              <w:jc w:val="left"/>
+            </w:pPr>
+            <w:r>
+              <w:rPr>
+                <w:rFonts w:ascii="Calibri" w:cs="Calibri" w:eastAsia="Calibri" w:hAnsi="Calibri"/>
+                <w:color w:val="1F2328"/>
+              </w:rPr>
+              <w:t xml:space="preserve">Pick Pocket</w:t>
+            </w:r>
+          </w:p>
+        </w:tc>
+        <w:tc>
+          <w:tcPr>
+            <w:tcW w:type="dxa" w:w="1591"/>
+            <w:tcBorders>
+              <w:top w:val="single" w:color="D0D7DE" w:sz="4"/>
+              <w:left w:val="single" w:color="D0D7DE" w:sz="4"/>
+              <w:bottom w:val="single" w:color="D0D7DE" w:sz="4"/>
+              <w:right w:val="single" w:color="D0D7DE" w:sz="4"/>
+            </w:tcBorders>
+            <w:tcMar>
+              <w:top w:type="dxa" w:w="60"/>
+              <w:left w:type="dxa" w:w="100"/>
+              <w:bottom w:type="dxa" w:w="60"/>
+              <w:right w:type="dxa" w:w="100"/>
+            </w:tcMar>
+          </w:tcPr>
+          <w:p>
+            <w:pPr>
+              <w:jc w:val="center"/>
+            </w:pPr>
+            <w:r>
+              <w:rPr>
+                <w:rFonts w:ascii="Calibri" w:cs="Calibri" w:eastAsia="Calibri" w:hAnsi="Calibri"/>
+                <w:color w:val="1F2328"/>
+              </w:rPr>
+              <w:t xml:space="preserve">11 (was 15)</w:t>
+            </w:r>
+          </w:p>
+        </w:tc>
+        <w:tc>
+          <w:tcPr>
+            <w:tcW w:type="dxa" w:w="1591"/>
+            <w:tcBorders>
+              <w:top w:val="single" w:color="D0D7DE" w:sz="4"/>
+              <w:left w:val="single" w:color="D0D7DE" w:sz="4"/>
+              <w:bottom w:val="single" w:color="D0D7DE" w:sz="4"/>
+              <w:right w:val="single" w:color="D0D7DE" w:sz="4"/>
+            </w:tcBorders>
+            <w:tcMar>
+              <w:top w:type="dxa" w:w="60"/>
+              <w:left w:type="dxa" w:w="100"/>
+              <w:bottom w:type="dxa" w:w="60"/>
+              <w:right w:type="dxa" w:w="100"/>
+            </w:tcMar>
+          </w:tcPr>
+          <w:p>
+            <w:pPr>
+              <w:jc w:val="center"/>
+            </w:pPr>
+            <w:r>
+              <w:rPr>
+                <w:rFonts w:ascii="Calibri" w:cs="Calibri" w:eastAsia="Calibri" w:hAnsi="Calibri"/>
+                <w:color w:val="1F2328"/>
+              </w:rPr>
+              <w:t xml:space="preserve">35 (was 50)</w:t>
+            </w:r>
+          </w:p>
+        </w:tc>
+        <w:tc>
+          <w:tcPr>
+            <w:tcW w:type="dxa" w:w="1591"/>
+            <w:tcBorders>
+              <w:top w:val="single" w:color="D0D7DE" w:sz="4"/>
+              <w:left w:val="single" w:color="D0D7DE" w:sz="4"/>
+              <w:bottom w:val="single" w:color="D0D7DE" w:sz="4"/>
+              <w:right w:val="single" w:color="D0D7DE" w:sz="4"/>
+            </w:tcBorders>
+            <w:tcMar>
+              <w:top w:type="dxa" w:w="60"/>
+              <w:left w:type="dxa" w:w="100"/>
+              <w:bottom w:type="dxa" w:w="60"/>
+              <w:right w:type="dxa" w:w="100"/>
+            </w:tcMar>
+          </w:tcPr>
+          <w:p>
+            <w:pPr>
+              <w:jc w:val="center"/>
+            </w:pPr>
+            <w:r>
+              <w:rPr>
+                <w:rFonts w:ascii="Calibri" w:cs="Calibri" w:eastAsia="Calibri" w:hAnsi="Calibri"/>
+                <w:color w:val="1F2328"/>
+              </w:rPr>
+              <w:t xml:space="preserve">84 (was 120)</w:t>
+            </w:r>
+          </w:p>
+        </w:tc>
+        <w:tc>
+          <w:tcPr>
+            <w:tcW w:type="dxa" w:w="1592"/>
+            <w:tcBorders>
+              <w:top w:val="single" w:color="D0D7DE" w:sz="4"/>
+              <w:left w:val="single" w:color="D0D7DE" w:sz="4"/>
+              <w:bottom w:val="single" w:color="D0D7DE" w:sz="4"/>
+              <w:right w:val="single" w:color="D0D7DE" w:sz="4"/>
+            </w:tcBorders>
+            <w:tcMar>
+              <w:top w:type="dxa" w:w="60"/>
+              <w:left w:type="dxa" w:w="100"/>
+              <w:bottom w:type="dxa" w:w="60"/>
+              <w:right w:type="dxa" w:w="100"/>
+            </w:tcMar>
+          </w:tcPr>
+          <w:p>
+            <w:pPr>
+              <w:jc w:val="center"/>
+            </w:pPr>
+            <w:r>
+              <w:rPr>
+                <w:rFonts w:ascii="Calibri" w:cs="Calibri" w:eastAsia="Calibri" w:hAnsi="Calibri"/>
+                <w:color w:val="1F2328"/>
+              </w:rPr>
+              <w:t xml:space="preserve">175 (was 250)</w:t>
+            </w:r>
+          </w:p>
+        </w:tc>
+      </w:tr>
+      <w:tr>
+        <w:trPr>
+          <w:cantSplit/>
+          <w:tblHeader w:val="false"/>
+        </w:trPr>
+        <w:tc>
+          <w:tcPr>
+            <w:tcW w:type="dxa" w:w="2995"/>
+            <w:tcBorders>
+              <w:top w:val="single" w:color="D0D7DE" w:sz="4"/>
+              <w:left w:val="single" w:color="D0D7DE" w:sz="4"/>
+              <w:bottom w:val="single" w:color="D0D7DE" w:sz="4"/>
+              <w:right w:val="single" w:color="D0D7DE" w:sz="4"/>
+            </w:tcBorders>
+            <w:tcMar>
+              <w:top w:type="dxa" w:w="60"/>
+              <w:left w:type="dxa" w:w="100"/>
+              <w:bottom w:type="dxa" w:w="60"/>
+              <w:right w:type="dxa" w:w="100"/>
+            </w:tcMar>
+          </w:tcPr>
+          <w:p>
+            <w:pPr>
+              <w:jc w:val="left"/>
+            </w:pPr>
+            <w:r>
+              <w:rPr>
+                <w:rFonts w:ascii="Calibri" w:cs="Calibri" w:eastAsia="Calibri" w:hAnsi="Calibri"/>
+                <w:color w:val="1F2328"/>
+              </w:rPr>
+              <w:t xml:space="preserve">Interceptor</w:t>
+            </w:r>
+          </w:p>
+        </w:tc>
+        <w:tc>
+          <w:tcPr>
+            <w:tcW w:type="dxa" w:w="1591"/>
+            <w:tcBorders>
+              <w:top w:val="single" w:color="D0D7DE" w:sz="4"/>
+              <w:left w:val="single" w:color="D0D7DE" w:sz="4"/>
+              <w:bottom w:val="single" w:color="D0D7DE" w:sz="4"/>
+              <w:right w:val="single" w:color="D0D7DE" w:sz="4"/>
+            </w:tcBorders>
+            <w:tcMar>
+              <w:top w:type="dxa" w:w="60"/>
+              <w:left w:type="dxa" w:w="100"/>
+              <w:bottom w:type="dxa" w:w="60"/>
+              <w:right w:type="dxa" w:w="100"/>
+            </w:tcMar>
+          </w:tcPr>
+          <w:p>
+            <w:pPr>
+              <w:jc w:val="center"/>
+            </w:pPr>
+            <w:r>
+              <w:rPr>
+                <w:rFonts w:ascii="Calibri" w:cs="Calibri" w:eastAsia="Calibri" w:hAnsi="Calibri"/>
+                <w:color w:val="1F2328"/>
+              </w:rPr>
+              <w:t xml:space="preserve">14 (was 20)</w:t>
+            </w:r>
+          </w:p>
+        </w:tc>
+        <w:tc>
+          <w:tcPr>
+            <w:tcW w:type="dxa" w:w="1591"/>
+            <w:tcBorders>
+              <w:top w:val="single" w:color="D0D7DE" w:sz="4"/>
+              <w:left w:val="single" w:color="D0D7DE" w:sz="4"/>
+              <w:bottom w:val="single" w:color="D0D7DE" w:sz="4"/>
+              <w:right w:val="single" w:color="D0D7DE" w:sz="4"/>
+            </w:tcBorders>
+            <w:tcMar>
+              <w:top w:type="dxa" w:w="60"/>
+              <w:left w:type="dxa" w:w="100"/>
+              <w:bottom w:type="dxa" w:w="60"/>
+              <w:right w:type="dxa" w:w="100"/>
+            </w:tcMar>
+          </w:tcPr>
+          <w:p>
+            <w:pPr>
+              <w:jc w:val="center"/>
+            </w:pPr>
+            <w:r>
+              <w:rPr>
+                <w:rFonts w:ascii="Calibri" w:cs="Calibri" w:eastAsia="Calibri" w:hAnsi="Calibri"/>
+                <w:color w:val="1F2328"/>
+              </w:rPr>
+              <w:t xml:space="preserve">42 (was 60)</w:t>
+            </w:r>
+          </w:p>
+        </w:tc>
+        <w:tc>
+          <w:tcPr>
+            <w:tcW w:type="dxa" w:w="1591"/>
+            <w:tcBorders>
+              <w:top w:val="single" w:color="D0D7DE" w:sz="4"/>
+              <w:left w:val="single" w:color="D0D7DE" w:sz="4"/>
+              <w:bottom w:val="single" w:color="D0D7DE" w:sz="4"/>
+              <w:right w:val="single" w:color="D0D7DE" w:sz="4"/>
+            </w:tcBorders>
+            <w:tcMar>
+              <w:top w:type="dxa" w:w="60"/>
+              <w:left w:type="dxa" w:w="100"/>
+              <w:bottom w:type="dxa" w:w="60"/>
+              <w:right w:type="dxa" w:w="100"/>
+            </w:tcMar>
+          </w:tcPr>
+          <w:p>
+            <w:pPr>
+              <w:jc w:val="center"/>
+            </w:pPr>
+            <w:r>
+              <w:rPr>
+                <w:rFonts w:ascii="Calibri" w:cs="Calibri" w:eastAsia="Calibri" w:hAnsi="Calibri"/>
+                <w:color w:val="1F2328"/>
+              </w:rPr>
+              <w:t xml:space="preserve">105 (was 150)</w:t>
+            </w:r>
+          </w:p>
+        </w:tc>
+        <w:tc>
+          <w:tcPr>
+            <w:tcW w:type="dxa" w:w="1592"/>
+            <w:tcBorders>
+              <w:top w:val="single" w:color="D0D7DE" w:sz="4"/>
+              <w:left w:val="single" w:color="D0D7DE" w:sz="4"/>
+              <w:bottom w:val="single" w:color="D0D7DE" w:sz="4"/>
+              <w:right w:val="single" w:color="D0D7DE" w:sz="4"/>
+            </w:tcBorders>
+            <w:tcMar>
+              <w:top w:type="dxa" w:w="60"/>
+              <w:left w:type="dxa" w:w="100"/>
+              <w:bottom w:type="dxa" w:w="60"/>
+              <w:right w:type="dxa" w:w="100"/>
+            </w:tcMar>
+          </w:tcPr>
+          <w:p>
+            <w:pPr>
+              <w:jc w:val="center"/>
+            </w:pPr>
+            <w:r>
+              <w:rPr>
+                <w:rFonts w:ascii="Calibri" w:cs="Calibri" w:eastAsia="Calibri" w:hAnsi="Calibri"/>
+                <w:color w:val="1F2328"/>
+              </w:rPr>
+              <w:t xml:space="preserve">210 (was 300)</w:t>
+            </w:r>
+          </w:p>
+        </w:tc>
+      </w:tr>
+    </w:tbl>
+    <w:p>
+      <w:pPr>
+        <w:spacing w:after="80"/>
+      </w:pPr>
+    </w:p>
+    <w:p>
+      <w:pPr>
+        <w:spacing w:after="140" w:line="288"/>
+      </w:pPr>
+      <w:r>
+        <w:rPr>
+          <w:rFonts w:ascii="Calibri" w:cs="Calibri" w:eastAsia="Calibri" w:hAnsi="Calibri"/>
+          <w:color w:val="1F2328"/>
+        </w:rPr>
+        <w:t xml:space="preserve">Steals you've already made count. A build that has already reached a new mark moves up the next time the game loads your profile, as long as its build allows that tier.</w:t>
+      </w:r>
+    </w:p>
     <w:sectPr>
       <w:pgSz w:w="12240" w:h="15840" w:orient="portrait"/>
       <w:pgMar w:top="1440" w:right="1440" w:bottom="1440" w:left="1440" w:header="708" w:footer="708" w:gutter="0"/>

</xml_diff>